<commit_message>
Simplify Genetics company profile: 10,000 embryos/yr, 21 years, contact
Co-Authored-By: Claude Opus 5.5 <noreply@anthropic.com>
Claude-Session: https://claude.ai/code/session_01YPrvsnF49qpSSDqPWf1MnS
</commit_message>
<xml_diff>
--- a/deliverables/Genetics_Company_Profile_EN.docx
+++ b/deliverables/Genetics_Company_Profile_EN.docx
@@ -4,25 +4,15 @@
   <w:body>
     <w:p>
       <w:pPr>
-        <w:spacing w:before="1800"/>
+        <w:spacing w:before="4000"/>
       </w:pPr>
       <w:r>
         <w:rPr>
           <w:b/>
-          <w:color w:val="1F6F8B"/>
-          <w:sz w:val="26"/>
+          <w:color w:val="0B2E4F"/>
+          <w:sz w:val="64"/>
         </w:rPr>
-        <w:t>GENETICS CO., LTD.</w:t>
-      </w:r>
-    </w:p>
-    <w:p>
-      <w:r>
-        <w:rPr>
-          <w:b/>
-          <w:color w:val="0B2E4F"/>
-          <w:sz w:val="60"/>
-        </w:rPr>
-        <w:t>Company Profile</w:t>
+        <w:t>Genetics Co., Ltd.</w:t>
       </w:r>
     </w:p>
     <w:p>
@@ -31,46 +21,7 @@
           <w:color w:val="555555"/>
           <w:sz w:val="28"/>
         </w:rPr>
-        <w:t>Dairy Embryo Production, Embryo Transfer and</w:t>
-        <w:br/>
-        <w:t>Korean Holstein Sexed Embryo Export</w:t>
-      </w:r>
-    </w:p>
-    <w:p>
-      <w:pPr>
-        <w:spacing w:before="600"/>
-      </w:pPr>
-      <w:r>
-        <w:rPr>
-          <w:b/>
-          <w:sz w:val="24"/>
-        </w:rPr>
-        <w:t>Prepared for the Ministry of Economy and Finance</w:t>
-        <w:br/>
-        <w:t>of the Republic of Uzbekistan</w:t>
-      </w:r>
-    </w:p>
-    <w:p>
-      <w:r>
-        <w:rPr>
-          <w:color w:val="555555"/>
-          <w:sz w:val="22"/>
-        </w:rPr>
-        <w:t>October 2026</w:t>
-      </w:r>
-    </w:p>
-    <w:p>
-      <w:pPr>
-        <w:spacing w:before="4000"/>
-      </w:pPr>
-      <w:r>
-        <w:rPr>
-          <w:color w:val="555555"/>
-          <w:sz w:val="20"/>
-        </w:rPr>
-        <w:t>Genetics Co., Ltd.  ·  Korea Animal Hospital</w:t>
-        <w:br/>
-        <w:t>Anseong, Gyeonggi-do, Republic of Korea</w:t>
+        <w:t>Korea Animal Hospital</w:t>
       </w:r>
     </w:p>
     <w:p>
@@ -92,7 +43,7 @@
           <w:color w:val="0B2E4F"/>
           <w:sz w:val="30"/>
         </w:rPr>
-        <w:t>1. Genetics at a Glance</w:t>
+        <w:t>About Genetics</w:t>
       </w:r>
     </w:p>
     <w:p>
@@ -115,7 +66,21 @@
           <w:b w:val="0"/>
           <w:i w:val="0"/>
         </w:rPr>
-        <w:t xml:space="preserve">. Together with its affiliated veterinary hospital, Korea Animal Hospital, the company produces and transfers Holstein embryos for Korean dairy farms and exports </w:t>
+        <w:t xml:space="preserve">. Together with its affiliated veterinary hospital, Korea Animal Hospital, the company has been in the embryo business for </w:t>
+      </w:r>
+      <w:r>
+        <w:rPr>
+          <w:b/>
+          <w:i w:val="0"/>
+        </w:rPr>
+        <w:t>21 years</w:t>
+      </w:r>
+      <w:r>
+        <w:rPr>
+          <w:b w:val="0"/>
+          <w:i w:val="0"/>
+        </w:rPr>
+        <w:t xml:space="preserve">, producing and transferring Holstein embryos for Korean dairy farms and exporting </w:t>
       </w:r>
       <w:r>
         <w:rPr>
@@ -129,7 +94,7 @@
           <w:b w:val="0"/>
           <w:i w:val="0"/>
         </w:rPr>
-        <w:t xml:space="preserve"> to Central Asia.</w:t>
+        <w:t xml:space="preserve"> abroad.</w:t>
       </w:r>
     </w:p>
     <w:tbl>
@@ -183,7 +148,36 @@
                 <w:i w:val="0"/>
                 <w:sz w:val="20"/>
               </w:rPr>
-              <w:t>, based in Anseong, Gyeonggi-do – the centre of Korea's dairy industry</w:t>
+              <w:t xml:space="preserve"> in Anseong, Gyeonggi-do – the centre of Korea's dairy industry</w:t>
+            </w:r>
+          </w:p>
+          <w:p>
+            <w:pPr>
+              <w:spacing w:after="40"/>
+            </w:pPr>
+            <w:r>
+              <w:rPr>
+                <w:b w:val="0"/>
+                <w:i w:val="0"/>
+                <w:sz w:val="20"/>
+              </w:rPr>
+              <w:t xml:space="preserve">•  </w:t>
+            </w:r>
+            <w:r>
+              <w:rPr>
+                <w:b/>
+                <w:i w:val="0"/>
+                <w:sz w:val="20"/>
+              </w:rPr>
+              <w:t>21 years</w:t>
+            </w:r>
+            <w:r>
+              <w:rPr>
+                <w:b w:val="0"/>
+                <w:i w:val="0"/>
+                <w:sz w:val="20"/>
+              </w:rPr>
+              <w:t xml:space="preserve"> of embryo production and embryo transfer</w:t>
             </w:r>
           </w:p>
           <w:p>
@@ -204,7 +198,7 @@
                 <w:i w:val="0"/>
                 <w:sz w:val="20"/>
               </w:rPr>
-              <w:t>3,000 embryo transfers</w:t>
+              <w:t>10,000 embryos produced and transferred per year</w:t>
             </w:r>
             <w:r>
               <w:rPr>
@@ -212,23 +206,7 @@
                 <w:i w:val="0"/>
                 <w:sz w:val="20"/>
               </w:rPr>
-              <w:t xml:space="preserve"> and about </w:t>
-            </w:r>
-            <w:r>
-              <w:rPr>
-                <w:b/>
-                <w:i w:val="0"/>
-                <w:sz w:val="20"/>
-              </w:rPr>
-              <w:t>4,000 embryos sold</w:t>
-            </w:r>
-            <w:r>
-              <w:rPr>
-                <w:b w:val="0"/>
-                <w:i w:val="0"/>
-                <w:sz w:val="20"/>
-              </w:rPr>
-              <w:t xml:space="preserve"> per year</w:t>
+              <w:t xml:space="preserve"> over the last 10 years</w:t>
             </w:r>
           </w:p>
           <w:p>
@@ -257,7 +235,7 @@
                 <w:i w:val="0"/>
                 <w:sz w:val="20"/>
               </w:rPr>
-              <w:t xml:space="preserve"> for our sexed, frozen IVF embryos transferred abroad over the last five years (company field data)</w:t>
+              <w:t xml:space="preserve"> for sexed, frozen IVF embryos transferred abroad over the last five years</w:t>
             </w:r>
           </w:p>
           <w:p>
@@ -278,44 +256,7 @@
                 <w:i w:val="0"/>
                 <w:sz w:val="20"/>
               </w:rPr>
-              <w:t>Mongolia, Uzbekistan and Kyrgyzstan</w:t>
-            </w:r>
-          </w:p>
-          <w:p>
-            <w:pPr>
-              <w:spacing w:after="40"/>
-            </w:pPr>
-            <w:r>
-              <w:rPr>
-                <w:b w:val="0"/>
-                <w:i w:val="0"/>
-                <w:sz w:val="20"/>
-              </w:rPr>
-              <w:t xml:space="preserve">•  About three years of Korean Holstein sexed embryo supply to </w:t>
-            </w:r>
-            <w:r>
-              <w:rPr>
-                <w:b/>
-                <w:i w:val="0"/>
-                <w:sz w:val="20"/>
-              </w:rPr>
-              <w:t>Uzbekistan</w:t>
-            </w:r>
-            <w:r>
-              <w:rPr>
-                <w:b w:val="0"/>
-                <w:i w:val="0"/>
-                <w:sz w:val="20"/>
-              </w:rPr>
-              <w:t xml:space="preserve"> in cooperation with Korea's </w:t>
-            </w:r>
-            <w:r>
-              <w:rPr>
-                <w:b/>
-                <w:i w:val="0"/>
-                <w:sz w:val="20"/>
-              </w:rPr>
-              <w:t>Rural Development Administration (RDA)</w:t>
+              <w:t>Uzbekistan, Mongolia and Kyrgyzstan</w:t>
             </w:r>
           </w:p>
         </w:tc>
@@ -325,23 +266,6 @@
       <w:pPr>
         <w:spacing w:after="40"/>
       </w:pPr>
-    </w:p>
-    <w:p>
-      <w:pPr>
-        <w:keepNext/>
-        <w:spacing w:before="280" w:after="80"/>
-        <w:pBdr>
-          <w:bottom w:val="single" w:sz="8" w:space="1" w:color="1F6F8B"/>
-        </w:pBdr>
-      </w:pPr>
-      <w:r>
-        <w:rPr>
-          <w:b/>
-          <w:color w:val="0B2E4F"/>
-          <w:sz w:val="30"/>
-        </w:rPr>
-        <w:t>2. Company Overview</w:t>
-      </w:r>
     </w:p>
     <w:tbl>
       <w:tblPr>
@@ -566,7 +490,7 @@
                 <w:i w:val="0"/>
                 <w:sz w:val="19"/>
               </w:rPr>
-              <w:t>Location</w:t>
+              <w:t>CEO</w:t>
             </w:r>
           </w:p>
         </w:tc>
@@ -574,49 +498,6 @@
           <w:tcPr>
             <w:tcW w:type="dxa" w:w="7370"/>
             <w:shd w:val="clear" w:color="auto" w:fill="EEF4F7"/>
-          </w:tcPr>
-          <w:p>
-            <w:pPr>
-              <w:spacing w:after="20"/>
-            </w:pPr>
-            <w:r/>
-            <w:r>
-              <w:rPr>
-                <w:b w:val="0"/>
-                <w:i w:val="0"/>
-                <w:sz w:val="19"/>
-              </w:rPr>
-              <w:t>29-67 Yanghyeop-gil, Bogae-myeon, Anseong-si, Gyeonggi-do, Republic of Korea</w:t>
-            </w:r>
-          </w:p>
-        </w:tc>
-      </w:tr>
-      <w:tr>
-        <w:trPr>
-          <w:cantSplit/>
-        </w:trPr>
-        <w:tc>
-          <w:tcPr>
-            <w:tcW w:type="dxa" w:w="2041"/>
-          </w:tcPr>
-          <w:p>
-            <w:pPr>
-              <w:spacing w:after="20"/>
-            </w:pPr>
-            <w:r/>
-            <w:r>
-              <w:rPr>
-                <w:b w:val="0"/>
-                <w:i w:val="0"/>
-                <w:sz w:val="19"/>
-              </w:rPr>
-              <w:t>CEO</w:t>
-            </w:r>
-          </w:p>
-        </w:tc>
-        <w:tc>
-          <w:tcPr>
-            <w:tcW w:type="dxa" w:w="7370"/>
           </w:tcPr>
           <w:p>
             <w:pPr>
@@ -641,7 +522,6 @@
         <w:tc>
           <w:tcPr>
             <w:tcW w:type="dxa" w:w="2041"/>
-            <w:shd w:val="clear" w:color="auto" w:fill="EEF4F7"/>
           </w:tcPr>
           <w:p>
             <w:pPr>
@@ -661,7 +541,6 @@
         <w:tc>
           <w:tcPr>
             <w:tcW w:type="dxa" w:w="7370"/>
-            <w:shd w:val="clear" w:color="auto" w:fill="EEF4F7"/>
           </w:tcPr>
           <w:p>
             <w:pPr>
@@ -686,6 +565,7 @@
         <w:tc>
           <w:tcPr>
             <w:tcW w:type="dxa" w:w="2041"/>
+            <w:shd w:val="clear" w:color="auto" w:fill="EEF4F7"/>
           </w:tcPr>
           <w:p>
             <w:pPr>
@@ -705,6 +585,7 @@
         <w:tc>
           <w:tcPr>
             <w:tcW w:type="dxa" w:w="7370"/>
+            <w:shd w:val="clear" w:color="auto" w:fill="EEF4F7"/>
           </w:tcPr>
           <w:p>
             <w:pPr>
@@ -718,51 +599,6 @@
                 <w:sz w:val="19"/>
               </w:rPr>
               <w:t>In-vitro embryo production (IVF), sexed embryos, embryo transfer, genomic selection, recipient-cow programmes, reproduction consulting, embryo export</w:t>
-            </w:r>
-          </w:p>
-        </w:tc>
-      </w:tr>
-      <w:tr>
-        <w:trPr>
-          <w:cantSplit/>
-        </w:trPr>
-        <w:tc>
-          <w:tcPr>
-            <w:tcW w:type="dxa" w:w="2041"/>
-            <w:shd w:val="clear" w:color="auto" w:fill="EEF4F7"/>
-          </w:tcPr>
-          <w:p>
-            <w:pPr>
-              <w:spacing w:after="20"/>
-            </w:pPr>
-            <w:r/>
-            <w:r>
-              <w:rPr>
-                <w:b w:val="0"/>
-                <w:i w:val="0"/>
-                <w:sz w:val="19"/>
-              </w:rPr>
-              <w:t>Related businesses</w:t>
-            </w:r>
-          </w:p>
-        </w:tc>
-        <w:tc>
-          <w:tcPr>
-            <w:tcW w:type="dxa" w:w="7370"/>
-            <w:shd w:val="clear" w:color="auto" w:fill="EEF4F7"/>
-          </w:tcPr>
-          <w:p>
-            <w:pPr>
-              <w:spacing w:after="20"/>
-            </w:pPr>
-            <w:r/>
-            <w:r>
-              <w:rPr>
-                <w:b w:val="0"/>
-                <w:i w:val="0"/>
-                <w:sz w:val="19"/>
-              </w:rPr>
-              <w:t>Song Young Shin Farm (A2A2 Jersey dairy and dairy processing); precision-livestock monitoring with rumen sensors (CowTalk AI); livestock environment technology (D2O)</w:t>
             </w:r>
           </w:p>
         </w:tc>
@@ -784,7 +620,7 @@
           <w:color w:val="1F6F8B"/>
           <w:sz w:val="23"/>
         </w:rPr>
-        <w:t>Founder and CEO – Dr. Hyunjae Ha, DVM</w:t>
+        <w:t>CEO – Dr. Hyunjae Ha, DVM</w:t>
       </w:r>
     </w:p>
     <w:p>
@@ -797,7 +633,7 @@
           <w:b w:val="0"/>
           <w:i w:val="0"/>
         </w:rPr>
-        <w:t>Doctor of Veterinary Medicine, Konkuk University (1999); Adjunct Professor, Konkuk University.</w:t>
+        <w:t>Doctor of Veterinary Medicine, Konkuk University; Adjunct Professor, Konkuk University.</w:t>
       </w:r>
     </w:p>
     <w:p>
@@ -810,7 +646,7 @@
           <w:b w:val="0"/>
           <w:i w:val="0"/>
         </w:rPr>
-        <w:t>More than 25 years in large-animal veterinary practice and 18+ years in embryo transfer and in-vitro fertilisation.</w:t>
+        <w:t>21 years in embryo transfer and in-vitro fertilisation; long career in large-animal veterinary practice.</w:t>
       </w:r>
     </w:p>
     <w:p>
@@ -823,7 +659,7 @@
           <w:b w:val="0"/>
           <w:i w:val="0"/>
         </w:rPr>
-        <w:t>Breeder of A2A2 Jersey cattle and operator of an organic dairy farm for over 15 years.</w:t>
+        <w:t>Breeder of A2A2 Jersey cattle and operator of an organic dairy farm (Song Young Shin Farm).</w:t>
       </w:r>
     </w:p>
     <w:p>
@@ -841,19 +677,6 @@
     </w:p>
     <w:p>
       <w:pPr>
-        <w:pStyle w:val="ListBullet"/>
-        <w:spacing w:after="40"/>
-      </w:pPr>
-      <w:r>
-        <w:rPr>
-          <w:b w:val="0"/>
-          <w:i w:val="0"/>
-        </w:rPr>
-        <w:t>Hands-on experience of embryo export and local transfer programmes in Central Asia (Mongolia, Uzbekistan, Kyrgyzstan).</w:t>
-      </w:r>
-    </w:p>
-    <w:p>
-      <w:pPr>
         <w:keepNext/>
         <w:spacing w:before="280" w:after="80"/>
         <w:pBdr>
@@ -866,7 +689,7 @@
           <w:color w:val="0B2E4F"/>
           <w:sz w:val="30"/>
         </w:rPr>
-        <w:t>3. What We Do</w:t>
+        <w:t>Business</w:t>
       </w:r>
     </w:p>
     <w:tbl>
@@ -909,7 +732,7 @@
                 <w:color w:val="FFFFFF"/>
                 <w:sz w:val="19"/>
               </w:rPr>
-              <w:t>Business area</w:t>
+              <w:t>Area</w:t>
             </w:r>
           </w:p>
         </w:tc>
@@ -1067,7 +890,7 @@
                 <w:i w:val="0"/>
                 <w:sz w:val="19"/>
               </w:rPr>
-              <w:t>Recipient selection, oestrus synchronisation and pregnancy diagnosis protocols</w:t>
+              <w:t>Recipient selection, oestrus synchronisation and pregnancy diagnosis</w:t>
             </w:r>
           </w:p>
         </w:tc>
@@ -1200,7 +1023,7 @@
                 <w:i w:val="0"/>
                 <w:sz w:val="19"/>
               </w:rPr>
-              <w:t>Training of local veterinarians and technicians in embryo transfer, thawing, pregnancy diagnosis and heifer rearing</w:t>
+              <w:t>Training of veterinarians and technicians in embryo transfer, thawing, pregnancy diagnosis and heifer rearing</w:t>
             </w:r>
           </w:p>
         </w:tc>
@@ -1224,7 +1047,7 @@
                 <w:i w:val="0"/>
                 <w:sz w:val="19"/>
               </w:rPr>
-              <w:t>Digital follow-up</w:t>
+              <w:t>Herd monitoring</w:t>
             </w:r>
           </w:p>
         </w:tc>
@@ -1243,7 +1066,7 @@
                 <w:i w:val="0"/>
                 <w:sz w:val="19"/>
               </w:rPr>
-              <w:t>Herd monitoring with rumen sensors and data platform (CowTalk AI) for reproduction and health management</w:t>
+              <w:t>Rumen-sensor monitoring and data platform (CowTalk AI) for reproduction and health management</w:t>
             </w:r>
           </w:p>
         </w:tc>
@@ -1268,7 +1091,7 @@
           <w:color w:val="0B2E4F"/>
           <w:sz w:val="30"/>
         </w:rPr>
-        <w:t>4. Production Technology and Quality Control</w:t>
+        <w:t>Technology</w:t>
       </w:r>
     </w:p>
     <w:tbl>
@@ -1280,9 +1103,8 @@
         <w:tblLook w:firstColumn="1" w:firstRow="1" w:lastColumn="0" w:lastRow="0" w:noHBand="0" w:noVBand="1" w:val="04A0"/>
       </w:tblPr>
       <w:tblGrid>
-        <w:gridCol w:w="1701"/>
-        <w:gridCol w:w="3969"/>
-        <w:gridCol w:w="3742"/>
+        <w:gridCol w:w="2041"/>
+        <w:gridCol w:w="7371"/>
       </w:tblGrid>
       <w:tr>
         <w:trPr>
@@ -1291,7 +1113,7 @@
         </w:trPr>
         <w:tc>
           <w:tcPr>
-            <w:tcW w:type="dxa" w:w="1701"/>
+            <w:tcW w:type="dxa" w:w="2041"/>
             <w:shd w:val="clear" w:color="auto" w:fill="0B2E4F"/>
           </w:tcPr>
           <w:p>
@@ -1310,7 +1132,7 @@
                 <w:b/>
                 <w:i w:val="0"/>
                 <w:color w:val="FFFFFF"/>
-                <w:sz w:val="18"/>
+                <w:sz w:val="19"/>
               </w:rPr>
               <w:t>Step</w:t>
             </w:r>
@@ -1318,7 +1140,7 @@
         </w:tc>
         <w:tc>
           <w:tcPr>
-            <w:tcW w:type="dxa" w:w="3969"/>
+            <w:tcW w:type="dxa" w:w="7370"/>
             <w:shd w:val="clear" w:color="auto" w:fill="0B2E4F"/>
           </w:tcPr>
           <w:p>
@@ -1337,36 +1159,9 @@
                 <w:b/>
                 <w:i w:val="0"/>
                 <w:color w:val="FFFFFF"/>
-                <w:sz w:val="18"/>
+                <w:sz w:val="19"/>
               </w:rPr>
-              <w:t>What we do</w:t>
-            </w:r>
-          </w:p>
-        </w:tc>
-        <w:tc>
-          <w:tcPr>
-            <w:tcW w:type="dxa" w:w="3742"/>
-            <w:shd w:val="clear" w:color="auto" w:fill="0B2E4F"/>
-          </w:tcPr>
-          <w:p>
-            <w:pPr>
-              <w:keepNext/>
-              <w:spacing w:after="20"/>
-            </w:pPr>
-            <w:r>
-              <w:rPr>
-                <w:b/>
-                <w:color w:val="FFFFFF"/>
-              </w:rPr>
-            </w:r>
-            <w:r>
-              <w:rPr>
-                <w:b/>
-                <w:i w:val="0"/>
-                <w:color w:val="FFFFFF"/>
-                <w:sz w:val="18"/>
-              </w:rPr>
-              <w:t>Why it matters</w:t>
+              <w:t>Method</w:t>
             </w:r>
           </w:p>
         </w:tc>
@@ -1377,7 +1172,7 @@
         </w:trPr>
         <w:tc>
           <w:tcPr>
-            <w:tcW w:type="dxa" w:w="1701"/>
+            <w:tcW w:type="dxa" w:w="2041"/>
           </w:tcPr>
           <w:p>
             <w:pPr>
@@ -1388,15 +1183,15 @@
               <w:rPr>
                 <w:b w:val="0"/>
                 <w:i w:val="0"/>
-                <w:sz w:val="18"/>
+                <w:sz w:val="19"/>
               </w:rPr>
-              <w:t>Oocyte source</w:t>
+              <w:t>Oocytes</w:t>
             </w:r>
           </w:p>
         </w:tc>
         <w:tc>
           <w:tcPr>
-            <w:tcW w:type="dxa" w:w="3969"/>
+            <w:tcW w:type="dxa" w:w="7370"/>
           </w:tcPr>
           <w:p>
             <w:pPr>
@@ -1407,28 +1202,9 @@
               <w:rPr>
                 <w:b w:val="0"/>
                 <w:i w:val="0"/>
-                <w:sz w:val="18"/>
+                <w:sz w:val="19"/>
               </w:rPr>
-              <w:t>Oocytes collected from ovaries of Korean Holstein cows</w:t>
-            </w:r>
-          </w:p>
-        </w:tc>
-        <w:tc>
-          <w:tcPr>
-            <w:tcW w:type="dxa" w:w="3742"/>
-          </w:tcPr>
-          <w:p>
-            <w:pPr>
-              <w:spacing w:after="20"/>
-            </w:pPr>
-            <w:r/>
-            <w:r>
-              <w:rPr>
-                <w:b w:val="0"/>
-                <w:i w:val="0"/>
-                <w:sz w:val="18"/>
-              </w:rPr>
-              <w:t>Large-scale, cost-efficient embryo production from the Korean Holstein population</w:t>
+              <w:t>Collected from ovaries of Korean Holstein cows</w:t>
             </w:r>
           </w:p>
         </w:tc>
@@ -1439,7 +1215,7 @@
         </w:trPr>
         <w:tc>
           <w:tcPr>
-            <w:tcW w:type="dxa" w:w="1701"/>
+            <w:tcW w:type="dxa" w:w="2041"/>
             <w:shd w:val="clear" w:color="auto" w:fill="EEF4F7"/>
           </w:tcPr>
           <w:p>
@@ -1451,7 +1227,7 @@
               <w:rPr>
                 <w:b w:val="0"/>
                 <w:i w:val="0"/>
-                <w:sz w:val="18"/>
+                <w:sz w:val="19"/>
               </w:rPr>
               <w:t>Fertilisation</w:t>
             </w:r>
@@ -1459,7 +1235,7 @@
         </w:tc>
         <w:tc>
           <w:tcPr>
-            <w:tcW w:type="dxa" w:w="3969"/>
+            <w:tcW w:type="dxa" w:w="7370"/>
             <w:shd w:val="clear" w:color="auto" w:fill="EEF4F7"/>
           </w:tcPr>
           <w:p>
@@ -1471,7 +1247,7 @@
               <w:rPr>
                 <w:b w:val="0"/>
                 <w:i w:val="0"/>
-                <w:sz w:val="18"/>
+                <w:sz w:val="19"/>
               </w:rPr>
               <w:t xml:space="preserve">In-vitro fertilisation with </w:t>
             </w:r>
@@ -1479,7 +1255,7 @@
               <w:rPr>
                 <w:b/>
                 <w:i w:val="0"/>
-                <w:sz w:val="18"/>
+                <w:sz w:val="19"/>
               </w:rPr>
               <w:t>sexed semen</w:t>
             </w:r>
@@ -1487,15 +1263,79 @@
               <w:rPr>
                 <w:b w:val="0"/>
                 <w:i w:val="0"/>
-                <w:sz w:val="18"/>
+                <w:sz w:val="19"/>
               </w:rPr>
-              <w:t xml:space="preserve"> from selected sires</w:t>
+              <w:t xml:space="preserve"> from selected sires – about 90% female calves</w:t>
+            </w:r>
+          </w:p>
+        </w:tc>
+      </w:tr>
+      <w:tr>
+        <w:trPr>
+          <w:cantSplit/>
+        </w:trPr>
+        <w:tc>
+          <w:tcPr>
+            <w:tcW w:type="dxa" w:w="2041"/>
+          </w:tcPr>
+          <w:p>
+            <w:pPr>
+              <w:spacing w:after="20"/>
+            </w:pPr>
+            <w:r/>
+            <w:r>
+              <w:rPr>
+                <w:b w:val="0"/>
+                <w:i w:val="0"/>
+                <w:sz w:val="19"/>
+              </w:rPr>
+              <w:t>Culture</w:t>
             </w:r>
           </w:p>
         </w:tc>
         <w:tc>
           <w:tcPr>
-            <w:tcW w:type="dxa" w:w="3742"/>
+            <w:tcW w:type="dxa" w:w="7370"/>
+          </w:tcPr>
+          <w:p>
+            <w:pPr>
+              <w:spacing w:after="20"/>
+            </w:pPr>
+            <w:r/>
+            <w:r>
+              <w:rPr>
+                <w:b w:val="0"/>
+                <w:i w:val="0"/>
+                <w:sz w:val="19"/>
+              </w:rPr>
+              <w:t xml:space="preserve">Each embryo cultured </w:t>
+            </w:r>
+            <w:r>
+              <w:rPr>
+                <w:b/>
+                <w:i w:val="0"/>
+                <w:sz w:val="19"/>
+              </w:rPr>
+              <w:t>individually</w:t>
+            </w:r>
+            <w:r>
+              <w:rPr>
+                <w:b w:val="0"/>
+                <w:i w:val="0"/>
+                <w:sz w:val="19"/>
+              </w:rPr>
+              <w:t>, keeping its dam and sire identity for full traceability</w:t>
+            </w:r>
+          </w:p>
+        </w:tc>
+      </w:tr>
+      <w:tr>
+        <w:trPr>
+          <w:cantSplit/>
+        </w:trPr>
+        <w:tc>
+          <w:tcPr>
+            <w:tcW w:type="dxa" w:w="2041"/>
             <w:shd w:val="clear" w:color="auto" w:fill="EEF4F7"/>
           </w:tcPr>
           <w:p>
@@ -1507,98 +1347,15 @@
               <w:rPr>
                 <w:b w:val="0"/>
                 <w:i w:val="0"/>
-                <w:sz w:val="18"/>
+                <w:sz w:val="19"/>
               </w:rPr>
-              <w:t>About 90% female calves expected</w:t>
-            </w:r>
-          </w:p>
-        </w:tc>
-      </w:tr>
-      <w:tr>
-        <w:trPr>
-          <w:cantSplit/>
-        </w:trPr>
-        <w:tc>
-          <w:tcPr>
-            <w:tcW w:type="dxa" w:w="1701"/>
-          </w:tcPr>
-          <w:p>
-            <w:pPr>
-              <w:spacing w:after="20"/>
-            </w:pPr>
-            <w:r/>
-            <w:r>
-              <w:rPr>
-                <w:b w:val="0"/>
-                <w:i w:val="0"/>
-                <w:sz w:val="18"/>
-              </w:rPr>
-              <w:t>Individual culture</w:t>
+              <w:t>Grading</w:t>
             </w:r>
           </w:p>
         </w:tc>
         <w:tc>
           <w:tcPr>
-            <w:tcW w:type="dxa" w:w="3969"/>
-          </w:tcPr>
-          <w:p>
-            <w:pPr>
-              <w:spacing w:after="20"/>
-            </w:pPr>
-            <w:r/>
-            <w:r>
-              <w:rPr>
-                <w:b w:val="0"/>
-                <w:i w:val="0"/>
-                <w:sz w:val="18"/>
-              </w:rPr>
-              <w:t xml:space="preserve">Each embryo is cultured </w:t>
-            </w:r>
-            <w:r>
-              <w:rPr>
-                <w:b/>
-                <w:i w:val="0"/>
-                <w:sz w:val="18"/>
-              </w:rPr>
-              <w:t>individually</w:t>
-            </w:r>
-            <w:r>
-              <w:rPr>
-                <w:b w:val="0"/>
-                <w:i w:val="0"/>
-                <w:sz w:val="18"/>
-              </w:rPr>
-              <w:t>, not in pooled batches</w:t>
-            </w:r>
-          </w:p>
-        </w:tc>
-        <w:tc>
-          <w:tcPr>
-            <w:tcW w:type="dxa" w:w="3742"/>
-          </w:tcPr>
-          <w:p>
-            <w:pPr>
-              <w:spacing w:after="20"/>
-            </w:pPr>
-            <w:r/>
-            <w:r>
-              <w:rPr>
-                <w:b w:val="0"/>
-                <w:i w:val="0"/>
-                <w:sz w:val="18"/>
-              </w:rPr>
-              <w:t>Every embryo keeps its dam and sire identity – full traceability for breeding records</w:t>
-            </w:r>
-          </w:p>
-        </w:tc>
-      </w:tr>
-      <w:tr>
-        <w:trPr>
-          <w:cantSplit/>
-        </w:trPr>
-        <w:tc>
-          <w:tcPr>
-            <w:tcW w:type="dxa" w:w="1701"/>
+            <w:tcW w:type="dxa" w:w="7370"/>
             <w:shd w:val="clear" w:color="auto" w:fill="EEF4F7"/>
           </w:tcPr>
           <w:p>
@@ -1610,15 +1367,79 @@
               <w:rPr>
                 <w:b w:val="0"/>
                 <w:i w:val="0"/>
-                <w:sz w:val="18"/>
+                <w:sz w:val="19"/>
               </w:rPr>
-              <w:t>Grading</w:t>
+              <w:t>By stage and quality following IETS guidance</w:t>
+            </w:r>
+          </w:p>
+        </w:tc>
+      </w:tr>
+      <w:tr>
+        <w:trPr>
+          <w:cantSplit/>
+        </w:trPr>
+        <w:tc>
+          <w:tcPr>
+            <w:tcW w:type="dxa" w:w="2041"/>
+          </w:tcPr>
+          <w:p>
+            <w:pPr>
+              <w:spacing w:after="20"/>
+            </w:pPr>
+            <w:r/>
+            <w:r>
+              <w:rPr>
+                <w:b w:val="0"/>
+                <w:i w:val="0"/>
+                <w:sz w:val="19"/>
+              </w:rPr>
+              <w:t>Freezing</w:t>
             </w:r>
           </w:p>
         </w:tc>
         <w:tc>
           <w:tcPr>
-            <w:tcW w:type="dxa" w:w="3969"/>
+            <w:tcW w:type="dxa" w:w="7370"/>
+          </w:tcPr>
+          <w:p>
+            <w:pPr>
+              <w:spacing w:after="20"/>
+            </w:pPr>
+            <w:r/>
+            <w:r>
+              <w:rPr>
+                <w:b w:val="0"/>
+                <w:i w:val="0"/>
+                <w:sz w:val="19"/>
+              </w:rPr>
+              <w:t xml:space="preserve">Slow freezing in ethylene glycol for </w:t>
+            </w:r>
+            <w:r>
+              <w:rPr>
+                <w:b/>
+                <w:i w:val="0"/>
+                <w:sz w:val="19"/>
+              </w:rPr>
+              <w:t>direct transfer</w:t>
+            </w:r>
+            <w:r>
+              <w:rPr>
+                <w:b w:val="0"/>
+                <w:i w:val="0"/>
+                <w:sz w:val="19"/>
+              </w:rPr>
+              <w:t xml:space="preserve"> – thawed and transferred on the farm like a semen straw</w:t>
+            </w:r>
+          </w:p>
+        </w:tc>
+      </w:tr>
+      <w:tr>
+        <w:trPr>
+          <w:cantSplit/>
+        </w:trPr>
+        <w:tc>
+          <w:tcPr>
+            <w:tcW w:type="dxa" w:w="2041"/>
             <w:shd w:val="clear" w:color="auto" w:fill="EEF4F7"/>
           </w:tcPr>
           <w:p>
@@ -1630,15 +1451,15 @@
               <w:rPr>
                 <w:b w:val="0"/>
                 <w:i w:val="0"/>
-                <w:sz w:val="18"/>
+                <w:sz w:val="19"/>
               </w:rPr>
-              <w:t>Embryos graded by stage and quality following IETS guidance</w:t>
+              <w:t>Documentation</w:t>
             </w:r>
           </w:p>
         </w:tc>
         <w:tc>
           <w:tcPr>
-            <w:tcW w:type="dxa" w:w="3742"/>
+            <w:tcW w:type="dxa" w:w="7370"/>
             <w:shd w:val="clear" w:color="auto" w:fill="EEF4F7"/>
           </w:tcPr>
           <w:p>
@@ -1650,136 +1471,9 @@
               <w:rPr>
                 <w:b w:val="0"/>
                 <w:i w:val="0"/>
-                <w:sz w:val="18"/>
+                <w:sz w:val="19"/>
               </w:rPr>
-              <w:t>Only transferable-grade embryos are frozen and exported</w:t>
-            </w:r>
-          </w:p>
-        </w:tc>
-      </w:tr>
-      <w:tr>
-        <w:trPr>
-          <w:cantSplit/>
-        </w:trPr>
-        <w:tc>
-          <w:tcPr>
-            <w:tcW w:type="dxa" w:w="1701"/>
-          </w:tcPr>
-          <w:p>
-            <w:pPr>
-              <w:spacing w:after="20"/>
-            </w:pPr>
-            <w:r/>
-            <w:r>
-              <w:rPr>
-                <w:b w:val="0"/>
-                <w:i w:val="0"/>
-                <w:sz w:val="18"/>
-              </w:rPr>
-              <w:t>Freezing</w:t>
-            </w:r>
-          </w:p>
-        </w:tc>
-        <w:tc>
-          <w:tcPr>
-            <w:tcW w:type="dxa" w:w="3969"/>
-          </w:tcPr>
-          <w:p>
-            <w:pPr>
-              <w:spacing w:after="20"/>
-            </w:pPr>
-            <w:r/>
-            <w:r>
-              <w:rPr>
-                <w:b/>
-                <w:i w:val="0"/>
-                <w:sz w:val="18"/>
-              </w:rPr>
-              <w:t>Slow freezing in ethylene glycol for direct transfer</w:t>
-            </w:r>
-          </w:p>
-        </w:tc>
-        <w:tc>
-          <w:tcPr>
-            <w:tcW w:type="dxa" w:w="3742"/>
-          </w:tcPr>
-          <w:p>
-            <w:pPr>
-              <w:spacing w:after="20"/>
-            </w:pPr>
-            <w:r/>
-            <w:r>
-              <w:rPr>
-                <w:b w:val="0"/>
-                <w:i w:val="0"/>
-                <w:sz w:val="18"/>
-              </w:rPr>
-              <w:t>Thawed and transferred on the farm like a semen straw – simple for field technicians</w:t>
-            </w:r>
-          </w:p>
-        </w:tc>
-      </w:tr>
-      <w:tr>
-        <w:trPr>
-          <w:cantSplit/>
-        </w:trPr>
-        <w:tc>
-          <w:tcPr>
-            <w:tcW w:type="dxa" w:w="1701"/>
-            <w:shd w:val="clear" w:color="auto" w:fill="EEF4F7"/>
-          </w:tcPr>
-          <w:p>
-            <w:pPr>
-              <w:spacing w:after="20"/>
-            </w:pPr>
-            <w:r/>
-            <w:r>
-              <w:rPr>
-                <w:b w:val="0"/>
-                <w:i w:val="0"/>
-                <w:sz w:val="18"/>
-              </w:rPr>
-              <w:t>Documentation</w:t>
-            </w:r>
-          </w:p>
-        </w:tc>
-        <w:tc>
-          <w:tcPr>
-            <w:tcW w:type="dxa" w:w="3969"/>
-            <w:shd w:val="clear" w:color="auto" w:fill="EEF4F7"/>
-          </w:tcPr>
-          <w:p>
-            <w:pPr>
-              <w:spacing w:after="20"/>
-            </w:pPr>
-            <w:r/>
-            <w:r>
-              <w:rPr>
-                <w:b w:val="0"/>
-                <w:i w:val="0"/>
-                <w:sz w:val="18"/>
-              </w:rPr>
-              <w:t>Embryo ID list, donor/sire records, health certificate per the importing country's requirements</w:t>
-            </w:r>
-          </w:p>
-        </w:tc>
-        <w:tc>
-          <w:tcPr>
-            <w:tcW w:type="dxa" w:w="3742"/>
-            <w:shd w:val="clear" w:color="auto" w:fill="EEF4F7"/>
-          </w:tcPr>
-          <w:p>
-            <w:pPr>
-              <w:spacing w:after="20"/>
-            </w:pPr>
-            <w:r/>
-            <w:r>
-              <w:rPr>
-                <w:b w:val="0"/>
-                <w:i w:val="0"/>
-                <w:sz w:val="18"/>
-              </w:rPr>
-              <w:t>Supports import approval and national breeding records</w:t>
+              <w:t>Embryo ID list, donor and sire records, health certificate</w:t>
             </w:r>
           </w:p>
         </w:tc>
@@ -1789,32 +1483,6 @@
       <w:pPr>
         <w:spacing w:after="40"/>
       </w:pPr>
-    </w:p>
-    <w:p>
-      <w:r>
-        <w:rPr>
-          <w:b w:val="0"/>
-          <w:i w:val="0"/>
-          <w:sz w:val="20"/>
-        </w:rPr>
-        <w:t xml:space="preserve">Field results depend strongly on recipient management. Our ~60% conception rate abroad was achieved with well-managed recipients; our recommended recipient is a </w:t>
-      </w:r>
-      <w:r>
-        <w:rPr>
-          <w:b/>
-          <w:i w:val="0"/>
-          <w:sz w:val="20"/>
-        </w:rPr>
-        <w:t>maiden heifer of breeding age</w:t>
-      </w:r>
-      <w:r>
-        <w:rPr>
-          <w:b w:val="0"/>
-          <w:i w:val="0"/>
-          <w:sz w:val="20"/>
-        </w:rPr>
-        <w:t xml:space="preserve"> in good body condition.</w:t>
-      </w:r>
     </w:p>
     <w:p>
       <w:pPr>
@@ -1830,144 +1498,7 @@
           <w:color w:val="0B2E4F"/>
           <w:sz w:val="30"/>
         </w:rPr>
-        <w:t>5. Why Korean Holstein Sexed Embryos</w:t>
-      </w:r>
-    </w:p>
-    <w:p>
-      <w:pPr>
-        <w:pStyle w:val="ListBullet"/>
-        <w:spacing w:after="40"/>
-      </w:pPr>
-      <w:r>
-        <w:rPr>
-          <w:b/>
-          <w:i w:val="0"/>
-        </w:rPr>
-        <w:t>Proven genetics:</w:t>
-      </w:r>
-      <w:r>
-        <w:rPr>
-          <w:b w:val="0"/>
-          <w:i w:val="0"/>
-        </w:rPr>
-        <w:t xml:space="preserve"> the Korean Holstein population has been improved for decades with top sires from North America and Europe and national milk recording.</w:t>
-      </w:r>
-    </w:p>
-    <w:p>
-      <w:pPr>
-        <w:pStyle w:val="ListBullet"/>
-        <w:spacing w:after="40"/>
-      </w:pPr>
-      <w:r>
-        <w:rPr>
-          <w:b/>
-          <w:i w:val="0"/>
-        </w:rPr>
-        <w:t>Climate fit:</w:t>
-      </w:r>
-      <w:r>
-        <w:rPr>
-          <w:b w:val="0"/>
-          <w:i w:val="0"/>
-        </w:rPr>
-        <w:t xml:space="preserve"> Korean herds are raised in intensive housing under hot summers and cold winters – conditions comparable in many respects to Uzbekistan's continental climate.</w:t>
-      </w:r>
-    </w:p>
-    <w:p>
-      <w:pPr>
-        <w:pStyle w:val="ListBullet"/>
-        <w:spacing w:after="40"/>
-      </w:pPr>
-      <w:r>
-        <w:rPr>
-          <w:b/>
-          <w:i w:val="0"/>
-        </w:rPr>
-        <w:t>Female calves:</w:t>
-      </w:r>
-      <w:r>
-        <w:rPr>
-          <w:b w:val="0"/>
-          <w:i w:val="0"/>
-        </w:rPr>
-        <w:t xml:space="preserve"> sexed semen means mainly female calves – the replacement heifers dairy farms need.</w:t>
-      </w:r>
-    </w:p>
-    <w:p>
-      <w:pPr>
-        <w:pStyle w:val="ListBullet"/>
-        <w:spacing w:after="40"/>
-      </w:pPr>
-      <w:r>
-        <w:rPr>
-          <w:b/>
-          <w:i w:val="0"/>
-        </w:rPr>
-        <w:t>Lower biosecurity risk:</w:t>
-      </w:r>
-      <w:r>
-        <w:rPr>
-          <w:b w:val="0"/>
-          <w:i w:val="0"/>
-        </w:rPr>
-        <w:t xml:space="preserve"> embryos handled to WOAH/IETS standards carry a much lower risk of disease transmission than live animals.</w:t>
-      </w:r>
-    </w:p>
-    <w:p>
-      <w:pPr>
-        <w:pStyle w:val="ListBullet"/>
-        <w:spacing w:after="40"/>
-      </w:pPr>
-      <w:r>
-        <w:rPr>
-          <w:b/>
-          <w:i w:val="0"/>
-        </w:rPr>
-        <w:t>Efficient logistics:</w:t>
-      </w:r>
-      <w:r>
-        <w:rPr>
-          <w:b w:val="0"/>
-          <w:i w:val="0"/>
-        </w:rPr>
-        <w:t xml:space="preserve"> thousands of embryos travel in one liquid-nitrogen container on a regular flight, without the cost, stress and losses of live-animal transport.</w:t>
-      </w:r>
-    </w:p>
-    <w:p>
-      <w:pPr>
-        <w:pStyle w:val="ListBullet"/>
-        <w:spacing w:after="40"/>
-      </w:pPr>
-      <w:r>
-        <w:rPr>
-          <w:b/>
-          <w:i w:val="0"/>
-        </w:rPr>
-        <w:t>Local benefit:</w:t>
-      </w:r>
-      <w:r>
-        <w:rPr>
-          <w:b w:val="0"/>
-          <w:i w:val="0"/>
-        </w:rPr>
-        <w:t xml:space="preserve"> calves are born in the importing country, local heifers are used as recipients, and local veterinarians gain new skills.</w:t>
-      </w:r>
-    </w:p>
-    <w:p>
-      <w:pPr>
-        <w:keepNext/>
-        <w:spacing w:before="280" w:after="80"/>
-        <w:pBdr>
-          <w:bottom w:val="single" w:sz="8" w:space="1" w:color="1F6F8B"/>
-        </w:pBdr>
-      </w:pPr>
-      <w:r>
-        <w:rPr>
-          <w:b/>
-          <w:color w:val="0B2E4F"/>
-          <w:sz w:val="30"/>
-        </w:rPr>
-        <w:t>6. International Experience</w:t>
+        <w:t>International Experience</w:t>
       </w:r>
     </w:p>
     <w:tbl>
@@ -2080,7 +1611,7 @@
                 <w:i w:val="0"/>
                 <w:sz w:val="19"/>
               </w:rPr>
-              <w:t>Korean Holstein sexed embryo supply for about three years in cooperation with RDA; on-site transfer support; smart-farming rumen-sensor pilot on about 50 cows</w:t>
+              <w:t>Korean Holstein sexed embryo supply in cooperation with Korea's Rural Development Administration (RDA); on-site transfer support; rumen-sensor herd monitoring pilot</w:t>
             </w:r>
           </w:p>
         </w:tc>
@@ -2202,14 +1733,7 @@
           <w:b/>
           <w:i w:val="0"/>
         </w:rPr>
-        <w:t>Dr. Hyunjae Ha, DVM</w:t>
-      </w:r>
-      <w:r>
-        <w:rPr>
-          <w:b w:val="0"/>
-          <w:i w:val="0"/>
-        </w:rPr>
-        <w:t xml:space="preserve"> – CEO, Genetics Co., Ltd. / Director, Korea Animal Hospital</w:t>
+        <w:t>Genetics Co., Ltd.</w:t>
       </w:r>
     </w:p>
     <w:p>
@@ -2227,11 +1751,10 @@
           <w:b w:val="0"/>
           <w:i w:val="0"/>
         </w:rPr>
-        <w:t>Tel. +82-31-674-4432   ·   E-mail: hhj3150@hanmail.net</w:t>
+        <w:t>E-mail: hhj3150@hanmail.net</w:t>
       </w:r>
     </w:p>
     <w:sectPr>
-      <w:footerReference w:type="default" r:id="rId9"/>
       <w:pgSz w:w="12240" w:h="15840"/>
       <w:pgMar w:top="1134" w:right="1247" w:bottom="1134" w:left="1247" w:header="720" w:footer="720" w:gutter="0"/>
       <w:cols w:space="720"/>
@@ -2239,24 +1762,6 @@
     </w:sectPr>
   </w:body>
 </w:document>
-</file>
-
-<file path=word/footer1.xml><?xml version="1.0" encoding="utf-8"?>
-<w:ftr xmlns:m="http://schemas.openxmlformats.org/officeDocument/2006/math" xmlns:mc="http://schemas.openxmlformats.org/markup-compatibility/2006" xmlns:mo="http://schemas.microsoft.com/office/mac/office/2008/main" xmlns:mv="urn:schemas-microsoft-com:mac:vml" xmlns:o="urn:schemas-microsoft-com:office:office" xmlns:r="http://schemas.openxmlformats.org/officeDocument/2006/relationships" xmlns:v="urn:schemas-microsoft-com:vml" xmlns:w10="urn:schemas-microsoft-com:office:word" xmlns:w14="http://schemas.microsoft.com/office/word/2010/wordml" xmlns:w="http://schemas.openxmlformats.org/wordprocessingml/2006/main" xmlns:wne="http://schemas.microsoft.com/office/word/2006/wordml" xmlns:wp14="http://schemas.microsoft.com/office/word/2010/wordprocessingDrawing" xmlns:wp="http://schemas.openxmlformats.org/drawingml/2006/wordprocessingDrawing" xmlns:wpc="http://schemas.microsoft.com/office/word/2010/wordprocessingCanvas" xmlns:wpg="http://schemas.microsoft.com/office/word/2010/wordprocessingGroup" xmlns:wpi="http://schemas.microsoft.com/office/word/2010/wordprocessingInk" xmlns:wps="http://schemas.microsoft.com/office/word/2010/wordprocessingShape" mc:Ignorable="w14 wp14">
-  <w:p>
-    <w:pPr>
-      <w:pStyle w:val="Footer"/>
-      <w:jc w:val="center"/>
-    </w:pPr>
-    <w:r>
-      <w:rPr>
-        <w:color w:val="555555"/>
-        <w:sz w:val="16"/>
-      </w:rPr>
-      <w:t>Genetics Co., Ltd.  ·  Company Profile  ·  October 2026</w:t>
-    </w:r>
-  </w:p>
-</w:ftr>
 </file>
 
 <file path=word/numbering.xml><?xml version="1.0" encoding="utf-8"?>

</xml_diff>

<commit_message>
Company profile: average conception rate 50-60%
Co-Authored-By: Claude Opus 5.5 <noreply@anthropic.com>
Claude-Session: https://claude.ai/code/session_01YPrvsnF49qpSSDqPWf1MnS
</commit_message>
<xml_diff>
--- a/deliverables/Genetics_Company_Profile_EN.docx
+++ b/deliverables/Genetics_Company_Profile_EN.docx
@@ -219,7 +219,7 @@
                 <w:i w:val="0"/>
                 <w:sz w:val="20"/>
               </w:rPr>
-              <w:t xml:space="preserve">•  Conception rate of about </w:t>
+              <w:t xml:space="preserve">•  Average conception rate of </w:t>
             </w:r>
             <w:r>
               <w:rPr>
@@ -227,15 +227,7 @@
                 <w:i w:val="0"/>
                 <w:sz w:val="20"/>
               </w:rPr>
-              <w:t>60%</w:t>
-            </w:r>
-            <w:r>
-              <w:rPr>
-                <w:b w:val="0"/>
-                <w:i w:val="0"/>
-                <w:sz w:val="20"/>
-              </w:rPr>
-              <w:t xml:space="preserve"> for sexed, frozen IVF embryos transferred abroad over the last five years</w:t>
+              <w:t>50–60%</w:t>
             </w:r>
           </w:p>
           <w:p>

</xml_diff>